<commit_message>
Update Module 11 Word document
</commit_message>
<xml_diff>
--- a/module-11/Moracchini_Assignment 11.3.docx
+++ b/module-11/Moracchini_Assignment 11.3.docx
@@ -121,6 +121,14 @@
           <w:bCs/>
         </w:rPr>
         <w:t>Java and JavaFX installation</w:t>
+      </w:r>
+      <w:r>
+        <w:rPr>
+          <w:rFonts w:ascii="Lucida Grande" w:hAnsi="Lucida Grande" w:cs="Lucida Grande"/>
+          <w:b/>
+          <w:bCs/>
+        </w:rPr>
+        <w:t xml:space="preserve"> (redo module 1.3)</w:t>
       </w:r>
     </w:p>
     <w:p>

</xml_diff>